<commit_message>
Expand geisha narration to 22 minutes with sourced work pressures
</commit_message>
<xml_diff>
--- a/geisha-script/Geisha-Clean-Narration.docx
+++ b/geisha-script/Geisha-Clean-Narration.docx
@@ -20,6 +20,16 @@
     <w:p>
       <w:r>
         <w:t>Before the night is over, you must do more than perform a beautiful song. You must help turn a room full of separate people into a party they want to remember.</w:t>
+      </w:r>
+    </w:p>
+    <w:p>
+      <w:r>
+        <w:t>The guests can drink, talk over one another and let their attention wander. You have to notice. The other performers depend on you. The establishment has an interest in how you behave.</w:t>
+      </w:r>
+    </w:p>
+    <w:p>
+      <w:r>
+        <w:t>Your own bad mood is not what anyone has come to pay for.</w:t>
       </w:r>
     </w:p>
     <w:p>
@@ -50,6 +60,16 @@
     <w:p>
       <w:r>
         <w:t>You play a passage. Then you return to it.</w:t>
+      </w:r>
+    </w:p>
+    <w:p>
+      <w:r>
+        <w:t>This is the part missing from a picture of a smiling performer. Repetition does not look like much. The same hands return to the same strings. The same section asks for attention again.</w:t>
+      </w:r>
+    </w:p>
+    <w:p>
+      <w:r>
+        <w:t>But when a party begins, you cannot ask the whole room to become your practice session. Preparation gives you somewhere to put the mistakes before they become part of a paid performance.</w:t>
       </w:r>
     </w:p>
     <w:p>
@@ -124,7 +144,42 @@
     </w:p>
     <w:p>
       <w:r>
-        <w:t>There is no need to invent a particular childhood for you to see the tension. Before a performer could earn money, someone had to provide instruction and support. The person paying those costs could also control the terms under which she worked.</w:t>
+        <w:t>The cheerful word training can hide a much harder transaction.</w:t>
+      </w:r>
+    </w:p>
+    <w:p>
+      <w:r>
+        <w:t>Mitford, writing around the end of this era, describes children being purchased to be brought up as singers. He also describes parents signing a paper that released the purchaser from responsibility in cases of sickness or accident.</w:t>
+      </w:r>
+    </w:p>
+    <w:p>
+      <w:r>
+        <w:t>That is his account of the arrangement, not a contract we can place in your own hands. But consider where it leaves the child. Adults negotiate the terms. The child is the person whose future work makes the arrangement valuable.</w:t>
+      </w:r>
+    </w:p>
+    <w:p>
+      <w:r>
+        <w:t>Before she can decide what kind of life she wants, other people can already be calculating what her accomplishments will earn.</w:t>
+      </w:r>
+    </w:p>
+    <w:p>
+      <w:r>
+        <w:t>And the same writer treats the purchaser's financial interest as reassurance that she will be cared for. To him, a valuable investment is a reason for confidence.</w:t>
+      </w:r>
+    </w:p>
+    <w:p>
+      <w:r>
+        <w:t>To the girl, being valuable to someone else is not the same as having control.</w:t>
+      </w:r>
+    </w:p>
+    <w:p>
+      <w:r>
+        <w:t>Not every performer entered through the same arrangement. But the profession included routes in which a child's training and an adult's financial interest were closely tied together. That is part of the world behind the accomplished woman who eventually enters the room.</w:t>
+      </w:r>
+    </w:p>
+    <w:p>
+      <w:r>
+        <w:t>You are following one establishment-based working life here. You can become very good at the work without becoming the person who sets its terms.</w:t>
       </w:r>
     </w:p>
     <w:p>
@@ -150,6 +205,21 @@
     <w:p>
       <w:r>
         <w:t>Clothes that look composed while you stand still must also look composed when you sit, rise, turn and handle an instrument.</w:t>
+      </w:r>
+    </w:p>
+    <w:p>
+      <w:r>
+        <w:t>Try separating the performer from the performance. You cannot leave your appearance at home and bring only your musical ability. You are the person they will watch as well as hear.</w:t>
+      </w:r>
+    </w:p>
+    <w:p>
+      <w:r>
+        <w:t>You turn back to the mirror. Then move away from it and test the movement again. The point is not to become motionless and perfect. It is to remain ready while doing the job.</w:t>
+      </w:r>
+    </w:p>
+    <w:p>
+      <w:r>
+        <w:t>By the time you arrive, the guests will meet a prepared appearance. They will not have shared the preparation.</w:t>
       </w:r>
     </w:p>
     <w:p>
@@ -215,6 +285,26 @@
     <w:p>
       <w:r>
         <w:t>The same group that helps produce the entertainment can bring information about the evening back to the establishment. Company and supervision can arrive together.</w:t>
+      </w:r>
+    </w:p>
+    <w:p>
+      <w:r>
+        <w:t>This changes the meaning of leaving the house. Going out for work does not necessarily mean stepping beyond the establishment's attention.</w:t>
+      </w:r>
+    </w:p>
+    <w:p>
+      <w:r>
+        <w:t>You travel with people who can help you perform. According to the same account, they are also meant to be a check on one another. You can value a colleague's skill without forgetting the arrangement that sends you out together.</w:t>
+      </w:r>
+    </w:p>
+    <w:p>
+      <w:r>
+        <w:t>It does not mean every woman beside you is an enemy. That would turn fellow workers into villains without evidence. It means that companionship and privacy are different things.</w:t>
+      </w:r>
+    </w:p>
+    <w:p>
+      <w:r>
+        <w:t>The people beside you may be the ones who understand the work best. Their presence is still part of how the work is supervised.</w:t>
       </w:r>
     </w:p>
     <w:p>
@@ -339,6 +429,21 @@
     </w:p>
     <w:p>
       <w:r>
+        <w:t>For the dancer, there is nowhere to put the body except inside the performance. Hands, posture, movement and expression are all visible together.</w:t>
+      </w:r>
+    </w:p>
+    <w:p>
+      <w:r>
+        <w:t>Your colleague can support you with the music. She cannot perform your movement for you. The effort that belonged to practice now has to become something other people can enjoy watching.</w:t>
+      </w:r>
+    </w:p>
+    <w:p>
+      <w:r>
+        <w:t>When the dance is finished, the demands will change. They will not disappear.</w:t>
+      </w:r>
+    </w:p>
+    <w:p>
+      <w:r>
         <w:t>This is one of the strange pressures of performing for pleasure: the effort matters enormously, but displaying the effort is not necessarily the point.</w:t>
       </w:r>
     </w:p>
@@ -354,7 +459,7 @@
     </w:p>
     <w:p>
       <w:r>
-        <w:t>If you imagine that this is the moment when the working evening is finished, you have only accounted for part of the job.</w:t>
+        <w:t>You have finished the dance. You have not finished the engagement.</w:t>
       </w:r>
     </w:p>
     <w:p>
@@ -404,6 +509,31 @@
     </w:p>
     <w:p>
       <w:r>
+        <w:t>Imagine the small difficulty of a remark that does not land. No grand scandal, no dramatic confrontation. Just a moment in which the room needs something different from what you have given it.</w:t>
+      </w:r>
+    </w:p>
+    <w:p>
+      <w:r>
+        <w:t>You cannot rewind the conversation as you could repeat a musical phrase during practice. You listen, adjust and try to find the next opening.</w:t>
+      </w:r>
+    </w:p>
+    <w:p>
+      <w:r>
+        <w:t>There is no score to follow now. The music gave you a piece you could prepare. This part of the evening asks you to keep responding to people whose next reaction you cannot know.</w:t>
+      </w:r>
+    </w:p>
+    <w:p>
+      <w:r>
+        <w:t>In an ordinary evening with friends, you might stop trying to carry the conversation. Here, helping the occasion along is part of the service.</w:t>
+      </w:r>
+    </w:p>
+    <w:p>
+      <w:r>
+        <w:t>You must be responsive without forgetting that you are working. The guest's enjoyment and your own enjoyment may overlap. They do not have to be identical.</w:t>
+      </w:r>
+    </w:p>
+    <w:p>
+      <w:r>
         <w:t>Now put alcohol into that room.</w:t>
       </w:r>
     </w:p>
@@ -429,7 +559,17 @@
     </w:p>
     <w:p>
       <w:r>
-        <w:t>That does not require an invented violent customer or a secret rescue. Ordinary sociability already asks something of you: you must respond while other people are enjoying the freedom not to be particularly careful.</w:t>
+        <w:t>The guest can enjoy being the centre of attention without having trained to entertain anyone. You are the professional helping the evening hold together around him.</w:t>
+      </w:r>
+    </w:p>
+    <w:p>
+      <w:r>
+        <w:t>He can become less careful as the evening goes on. Your work still asks you to pay attention. The party may be loosening up, but you cannot stop noticing what is happening around you.</w:t>
+      </w:r>
+    </w:p>
+    <w:p>
+      <w:r>
+        <w:t>Serving the drink is one task. Responding to the atmosphere around the drink is another. The sake bottle does not come with a promise that everyone will remain easy company.</w:t>
       </w:r>
     </w:p>
     <w:p>
@@ -524,7 +664,22 @@
     </w:p>
     <w:p>
       <w:r>
-        <w:t>Nor should we pretend we have your exact balance sheet. A fee is not a fortune, a gift is not a guaranteed escape, and one successful party does not settle a working life.</w:t>
+        <w:t>Do not mistake that for a claim that you receive nothing. The account distinguishes the establishment's fee from a gift intended for you. It does not give us a full account of every woman's wages, costs or savings.</w:t>
+      </w:r>
+    </w:p>
+    <w:p>
+      <w:r>
+        <w:t>But it does reveal a limit: the amount paid to hire you is not automatically an amount you can take away and spend as you choose.</w:t>
+      </w:r>
+    </w:p>
+    <w:p>
+      <w:r>
+        <w:t>Admiration can make you desirable to customers. Desirability can make you valuable to the business. Neither tells us, by itself, how much freedom you have gained.</w:t>
+      </w:r>
+    </w:p>
+    <w:p>
+      <w:r>
+        <w:t>A separate present can matter without becoming a magical way out. There is another engagement to think about, and the arrangement behind the work has not vanished because tonight went well.</w:t>
       </w:r>
     </w:p>
     <w:p>
@@ -574,7 +729,32 @@
     </w:p>
     <w:p>
       <w:r>
-        <w:t>The people who wrote about this world often watched it from the guest's side. We do not have to accept their prejudices to recognise the work they describe.</w:t>
+        <w:t>There is one more uncomfortable part of this life, visible in the way other people write about it.</w:t>
+      </w:r>
+    </w:p>
+    <w:p>
+      <w:r>
+        <w:t>Later, after the Edo period has ended, Alice Mabel Bacon will describe geisha as witty, accomplished and well dressed. Then, in the same discussion, she will cast judgement on their morals.</w:t>
+      </w:r>
+    </w:p>
+    <w:p>
+      <w:r>
+        <w:t>Her opinion is not evidence that the women deserve the judgement. It is evidence of the judgement itself.</w:t>
+      </w:r>
+    </w:p>
+    <w:p>
+      <w:r>
+        <w:t>The accomplishments that make an entertainer attractive to customers do not necessarily persuade an observer to respect her. A woman can be praised for the pleasure she supplies and condemned for the occupation through which she supplies it.</w:t>
+      </w:r>
+    </w:p>
+    <w:p>
+      <w:r>
+        <w:t>That later account is not your diary. It shows how easily the person doing the work can disappear behind someone else's verdict.</w:t>
+      </w:r>
+    </w:p>
+    <w:p>
+      <w:r>
+        <w:t>A flattering description is no guarantee that the writer will grant the performer dignity. Being admired and being respected are not the same reward.</w:t>
       </w:r>
     </w:p>
     <w:p>
@@ -609,7 +789,7 @@
     </w:p>
     <w:p>
       <w:r>
-        <w:t>Which part of that work surprised you most: the artistic training, the responsibility for the atmosphere, or the difference between being paid for and being paid yourself?</w:t>
+        <w:t>Which would you find hardest: being watched by your own establishment, having to keep paying guests entertained, or knowing that the fee for your work was not yours to control?</w:t>
       </w:r>
     </w:p>
     <w:p>

</xml_diff>